<commit_message>
Rebrand application to GrowSnap One with tagline Master Suite of Applications
</commit_message>
<xml_diff>
--- a/GrowSnap_User_Installation_Guide.docx
+++ b/GrowSnap_User_Installation_Guide.docx
@@ -7,13 +7,7 @@
         <w:jc w:val="center"/>
       </w:pPr>
       <w:r>
-        <w:rPr>
-          <w:rFonts w:ascii="Arial" w:hAnsi="Arial"/>
-          <w:b/>
-          <w:color w:val="2ECC71"/>
-          <w:sz w:val="52"/>
-        </w:rPr>
-        <w:t>🚀 GrowSnap Creative Suite</w:t>
+        <w:t>🚀 GrowSnap One</w:t>
       </w:r>
     </w:p>
     <w:p>
@@ -313,10 +307,7 @@
     </w:p>
     <w:p>
       <w:r>
-        <w:rPr>
-          <w:rFonts w:ascii="Arial" w:hAnsi="Arial"/>
-        </w:rPr>
-        <w:t>Once the setup progress bar reaches 100%, the main GrowSnap Creative Suite dashboard will launch automatically, and you are ready to begin!</w:t>
+        <w:t>Once the setup progress bar reaches 100%, the main GrowSnap One dashboard will launch automatically, and you are ready to begin!</w:t>
       </w:r>
     </w:p>
     <w:p>

</xml_diff>